<commit_message>
actualizados contratos adopcion y acogida para que sean iguales
</commit_message>
<xml_diff>
--- a/app/contracts/contrato_acogida.docx
+++ b/app/contracts/contrato_acogida.docx
@@ -113,29 +113,7 @@
           <w:sz w:val="20"/>
           <w:szCs w:val="20"/>
         </w:rPr>
-        <w:t xml:space="preserve">Dña. Andrea María Quintana García con D.N.I 70905660-H, en representación de la Asociación Protectora de Animales y Plantas “Siempre Fiel”, con CIF G37511995 con domicilio en María Auxiliadora, </w:t>
-      </w:r>
-      <w:proofErr w:type="spellStart"/>
-      <w:r>
-        <w:rPr>
-          <w:rFonts w:ascii="Times New Roman" w:eastAsia="Times New Roman" w:hAnsi="Times New Roman" w:cs="Times New Roman"/>
-          <w:b/>
-          <w:bCs/>
-          <w:sz w:val="20"/>
-          <w:szCs w:val="20"/>
-        </w:rPr>
-        <w:t>nº</w:t>
-      </w:r>
-      <w:proofErr w:type="spellEnd"/>
-      <w:r>
-        <w:rPr>
-          <w:rFonts w:ascii="Times New Roman" w:eastAsia="Times New Roman" w:hAnsi="Times New Roman" w:cs="Times New Roman"/>
-          <w:b/>
-          <w:bCs/>
-          <w:sz w:val="20"/>
-          <w:szCs w:val="20"/>
-        </w:rPr>
-        <w:t xml:space="preserve"> 2, 37004, Salamanca, con teléfono OFICIAL </w:t>
+        <w:t xml:space="preserve">Dña. Andrea María Quintana García con D.N.I 70905660-H, en representación de la Asociación Protectora de Animales y Plantas “Siempre Fiel”, con CIF G37511995 con domicilio en María Auxiliadora, nº 2, 37004, Salamanca, con teléfono OFICIAL </w:t>
       </w:r>
       <w:r>
         <w:rPr>
@@ -900,7 +878,6 @@
                 <w:szCs w:val="20"/>
               </w:rPr>
             </w:pPr>
-            <w:proofErr w:type="spellStart"/>
             <w:r>
               <w:rPr>
                 <w:rFonts w:ascii="Times New Roman" w:eastAsia="Times New Roman" w:hAnsi="Times New Roman" w:cs="Times New Roman"/>
@@ -909,18 +886,7 @@
                 <w:sz w:val="20"/>
                 <w:szCs w:val="20"/>
               </w:rPr>
-              <w:t>Nº</w:t>
-            </w:r>
-            <w:proofErr w:type="spellEnd"/>
-            <w:r>
-              <w:rPr>
-                <w:rFonts w:ascii="Times New Roman" w:eastAsia="Times New Roman" w:hAnsi="Times New Roman" w:cs="Times New Roman"/>
-                <w:b/>
-                <w:bCs/>
-                <w:sz w:val="20"/>
-                <w:szCs w:val="20"/>
-              </w:rPr>
-              <w:t xml:space="preserve"> PASAPORTE: </w:t>
+              <w:t xml:space="preserve">Nº PASAPORTE: </w:t>
             </w:r>
           </w:p>
         </w:tc>
@@ -1022,7 +988,6 @@
                 <w:szCs w:val="20"/>
               </w:rPr>
             </w:pPr>
-            <w:proofErr w:type="gramStart"/>
             <w:r>
               <w:rPr>
                 <w:rFonts w:ascii="Times New Roman" w:eastAsia="Times New Roman" w:hAnsi="Times New Roman" w:cs="Times New Roman"/>
@@ -1031,9 +996,8 @@
                 <w:sz w:val="20"/>
                 <w:szCs w:val="20"/>
               </w:rPr>
-              <w:t>F.NACIMIENTO</w:t>
+              <w:t>F. NACIMIENTO</w:t>
             </w:r>
-            <w:proofErr w:type="gramEnd"/>
             <w:r>
               <w:rPr>
                 <w:rFonts w:ascii="Times New Roman" w:eastAsia="Times New Roman" w:hAnsi="Times New Roman" w:cs="Times New Roman"/>
@@ -1305,21 +1269,19 @@
         <w:lastRenderedPageBreak/>
         <w:t xml:space="preserve">Si la persona quiere ayudar con alguna colaboración en su mantenimiento, soporte alimenticio adecuado, materiales, asistencia veterinaria, </w:t>
       </w:r>
-      <w:proofErr w:type="spellStart"/>
       <w:r>
         <w:rPr>
           <w:rFonts w:ascii="Times New Roman" w:eastAsia="Times New Roman" w:hAnsi="Times New Roman" w:cs="Times New Roman"/>
           <w:color w:val="000000"/>
         </w:rPr>
-        <w:t>etc</w:t>
-      </w:r>
-      <w:proofErr w:type="spellEnd"/>
+        <w:t>etc.</w:t>
+      </w:r>
       <w:r>
         <w:rPr>
           <w:rFonts w:ascii="Times New Roman" w:eastAsia="Times New Roman" w:hAnsi="Times New Roman" w:cs="Times New Roman"/>
           <w:color w:val="000000"/>
         </w:rPr>
-        <w:t>… puede hacerlo de forma altruista como donación a la protectora (no se admiten requerimientos económicos después de cualquier tipo de donación voluntaria por parte del titular de la acogida o personas que convivan con ésta).</w:t>
+        <w:t xml:space="preserve"> puede hacerlo de forma altruista como donación a la protectora (no se admiten requerimientos económicos después de cualquier tipo de donación voluntaria por parte del titular de la acogida o personas que convivan con ésta).</w:t>
       </w:r>
     </w:p>
     <w:p>
@@ -1522,7 +1484,7 @@
           <w:bCs/>
           <w:shd w:val="clear" w:color="auto" w:fill="FF9900"/>
         </w:rPr>
-        <w:t xml:space="preserve">LA SUELTA DEL ANIMAL FUERA DE SU DOMICILIO, TAMPOCO </w:t>
+        <w:t>LA SUELTA DEL ANIMAL FUERA DE SU DOMICILIO, TAMPOCO EN</w:t>
       </w:r>
       <w:r>
         <w:rPr>
@@ -1531,7 +1493,7 @@
           <w:bCs/>
           <w:shd w:val="clear" w:color="auto" w:fill="FF9900"/>
         </w:rPr>
-        <w:t>EN PARQUES</w:t>
+        <w:t xml:space="preserve"> PAR</w:t>
       </w:r>
       <w:r>
         <w:rPr>
@@ -1540,7 +1502,7 @@
           <w:bCs/>
           <w:shd w:val="clear" w:color="auto" w:fill="FF9900"/>
         </w:rPr>
-        <w:t xml:space="preserve"> HOMOLOGADOS PARA PERROS (</w:t>
+        <w:t>QUES HOMOLOGADOS PARA PERROS (</w:t>
       </w:r>
       <w:r>
         <w:rPr>
@@ -1594,7 +1556,7 @@
           <w:noProof/>
         </w:rPr>
         <w:drawing>
-          <wp:anchor distT="114300" distB="114300" distL="114300" distR="114300" simplePos="0" relativeHeight="251658240" behindDoc="0" locked="0" layoutInCell="1" hidden="0" allowOverlap="1" wp14:anchorId="682DFBF9" wp14:editId="472865CF">
+          <wp:anchor distT="114300" distB="114300" distL="114300" distR="114300" simplePos="0" relativeHeight="251658240" behindDoc="0" locked="0" layoutInCell="1" hidden="0" allowOverlap="1" wp14:anchorId="4DA29199" wp14:editId="70B87851">
             <wp:simplePos x="0" y="0"/>
             <wp:positionH relativeFrom="column">
               <wp:posOffset>4095750</wp:posOffset>
@@ -1644,7 +1606,7 @@
           <w:ilvl w:val="0"/>
           <w:numId w:val="1"/>
         </w:numPr>
-        <w:ind w:left="283" w:firstLine="283"/>
+        <w:ind w:left="283" w:firstLine="0"/>
         <w:jc w:val="both"/>
         <w:rPr>
           <w:rFonts w:ascii="Times New Roman" w:eastAsia="Times New Roman" w:hAnsi="Times New Roman" w:cs="Times New Roman"/>
@@ -1676,21 +1638,7 @@
         <w:rPr>
           <w:rFonts w:ascii="Times New Roman" w:eastAsia="Times New Roman" w:hAnsi="Times New Roman" w:cs="Times New Roman"/>
         </w:rPr>
-        <w:t xml:space="preserve">, </w:t>
-      </w:r>
-      <w:proofErr w:type="spellStart"/>
-      <w:r>
-        <w:rPr>
-          <w:rFonts w:ascii="Times New Roman" w:eastAsia="Times New Roman" w:hAnsi="Times New Roman" w:cs="Times New Roman"/>
-        </w:rPr>
-        <w:t>martingale</w:t>
-      </w:r>
-      <w:proofErr w:type="spellEnd"/>
-      <w:r>
-        <w:rPr>
-          <w:rFonts w:ascii="Times New Roman" w:eastAsia="Times New Roman" w:hAnsi="Times New Roman" w:cs="Times New Roman"/>
-        </w:rPr>
-        <w:t xml:space="preserve"> y correa doble anclada al collar y arnés siempre los elementos ajustarlos antes de salir a la calle.                      </w:t>
+        <w:t xml:space="preserve">, martingale y correa doble anclada al collar y arnés siempre los elementos ajustarlos </w:t>
       </w:r>
     </w:p>
     <w:p>
@@ -1703,12 +1651,27 @@
       </w:pPr>
       <w:r>
         <w:rPr>
+          <w:rFonts w:ascii="Times New Roman" w:eastAsia="Times New Roman" w:hAnsi="Times New Roman" w:cs="Times New Roman"/>
+        </w:rPr>
+        <w:t xml:space="preserve">             antes de salir a la calle.                      </w:t>
+      </w:r>
+    </w:p>
+    <w:p>
+      <w:pPr>
+        <w:ind w:firstLine="283"/>
+        <w:jc w:val="both"/>
+        <w:rPr>
+          <w:rFonts w:ascii="Times New Roman" w:eastAsia="Times New Roman" w:hAnsi="Times New Roman" w:cs="Times New Roman"/>
+        </w:rPr>
+      </w:pPr>
+      <w:r>
+        <w:rPr>
           <w:noProof/>
         </w:rPr>
         <mc:AlternateContent>
-          <mc:Choice Requires="wpg">
+          <mc:Choice Requires="wps">
             <w:drawing>
-              <wp:anchor distT="114300" distB="114300" distL="114300" distR="114300" simplePos="0" relativeHeight="251659264" behindDoc="0" locked="0" layoutInCell="1" hidden="0" allowOverlap="1" wp14:anchorId="73D694AE" wp14:editId="0A12D94A">
+              <wp:anchor distT="114300" distB="114300" distL="114300" distR="114300" simplePos="0" relativeHeight="251659264" behindDoc="0" locked="0" layoutInCell="1" hidden="0" allowOverlap="1" wp14:anchorId="6FEC9E2E" wp14:editId="637D3422">
                 <wp:simplePos x="0" y="0"/>
                 <wp:positionH relativeFrom="column">
                   <wp:posOffset>4062413</wp:posOffset>
@@ -1765,47 +1728,29 @@
               </wp:anchor>
             </w:drawing>
           </mc:Choice>
-          <mc:Fallback xmlns:sl="http://schemas.openxmlformats.org/schemaLibrary/2006/main" xmlns:a="http://schemas.openxmlformats.org/drawingml/2006/main" xmlns:pic="http://schemas.openxmlformats.org/drawingml/2006/picture" xmlns:c="http://schemas.openxmlformats.org/drawingml/2006/chart" xmlns:lc="http://schemas.openxmlformats.org/drawingml/2006/lockedCanvas" xmlns:dgm="http://schemas.openxmlformats.org/drawingml/2006/diagram" xmlns="http://schemas.microsoft.com/office/tasks/2019/documenttasks" xmlns:cr="http://schemas.microsoft.com/office/comments/2020/reactions">
-            <w:drawing>
-              <wp:anchor allowOverlap="1" behindDoc="0" distB="114300" distT="114300" distL="114300" distR="114300" hidden="0" layoutInCell="1" locked="0" relativeHeight="0" simplePos="0">
-                <wp:simplePos x="0" y="0"/>
-                <wp:positionH relativeFrom="column">
-                  <wp:posOffset>4062413</wp:posOffset>
-                </wp:positionH>
-                <wp:positionV relativeFrom="paragraph">
-                  <wp:posOffset>86680</wp:posOffset>
-                </wp:positionV>
-                <wp:extent cx="2279015" cy="419100"/>
-                <wp:effectExtent b="0" l="0" r="0" t="0"/>
-                <wp:wrapNone/>
-                <wp:docPr id="28" name="image5.png"/>
-                <a:graphic>
-                  <a:graphicData uri="http://schemas.openxmlformats.org/drawingml/2006/picture">
-                    <pic:pic>
-                      <pic:nvPicPr>
-                        <pic:cNvPr id="0" name="image5.png"/>
-                        <pic:cNvPicPr preferRelativeResize="0"/>
-                      </pic:nvPicPr>
-                      <pic:blipFill>
-                        <a:blip r:embed="rId11"/>
-                        <a:srcRect/>
-                        <a:stretch>
-                          <a:fillRect/>
-                        </a:stretch>
-                      </pic:blipFill>
-                      <pic:spPr>
-                        <a:xfrm>
-                          <a:off x="0" y="0"/>
-                          <a:ext cx="2279015" cy="419100"/>
-                        </a:xfrm>
-                        <a:prstGeom prst="rect"/>
-                        <a:ln/>
-                      </pic:spPr>
-                    </pic:pic>
-                  </a:graphicData>
-                </a:graphic>
-              </wp:anchor>
-            </w:drawing>
+          <mc:Fallback>
+            <w:pict>
+              <v:rect w14:anchorId="6FEC9E2E" id="Rectángulo 28" o:spid="_x0000_s1026" style="position:absolute;left:0;text-align:left;margin-left:319.9pt;margin-top:6.85pt;width:179.45pt;height:33pt;z-index:251659264;visibility:visible;mso-wrap-style:square;mso-wrap-distance-left:9pt;mso-wrap-distance-top:9pt;mso-wrap-distance-right:9pt;mso-wrap-distance-bottom:9pt;mso-position-horizontal:absolute;mso-position-horizontal-relative:text;mso-position-vertical:absolute;mso-position-vertical-relative:text;v-text-anchor:top" o:gfxdata="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" filled="f" stroked="f">
+                <v:textbox inset="2.53958mm,2.53958mm,2.53958mm,2.53958mm">
+                  <w:txbxContent>
+                    <w:p>
+                      <w:pPr>
+                        <w:spacing w:line="240" w:lineRule="auto"/>
+                        <w:textDirection w:val="btLr"/>
+                      </w:pPr>
+                      <w:r>
+                        <w:rPr>
+                          <w:b/>
+                          <w:color w:val="000000"/>
+                          <w:sz w:val="28"/>
+                        </w:rPr>
+                        <w:t>ARNÉS TRIPLE</w:t>
+                      </w:r>
+                    </w:p>
+                  </w:txbxContent>
+                </v:textbox>
+              </v:rect>
+            </w:pict>
           </mc:Fallback>
         </mc:AlternateContent>
       </w:r>
@@ -1906,7 +1851,7 @@
           <w:noProof/>
         </w:rPr>
         <w:drawing>
-          <wp:anchor distT="0" distB="0" distL="0" distR="0" simplePos="0" relativeHeight="251660288" behindDoc="1" locked="0" layoutInCell="1" hidden="0" allowOverlap="1" wp14:anchorId="1026ABF3" wp14:editId="369F485E">
+          <wp:anchor distT="0" distB="0" distL="0" distR="0" simplePos="0" relativeHeight="251660288" behindDoc="1" locked="0" layoutInCell="1" hidden="0" allowOverlap="1" wp14:anchorId="5545EC12" wp14:editId="767E41B5">
             <wp:simplePos x="0" y="0"/>
             <wp:positionH relativeFrom="column">
               <wp:posOffset>4169100</wp:posOffset>
@@ -1927,7 +1872,7 @@
                     <pic:cNvPicPr preferRelativeResize="0"/>
                   </pic:nvPicPr>
                   <pic:blipFill>
-                    <a:blip r:embed="rId12"/>
+                    <a:blip r:embed="rId11"/>
                     <a:srcRect/>
                     <a:stretch>
                       <a:fillRect/>
@@ -2009,9 +1954,9 @@
           <w:noProof/>
         </w:rPr>
         <mc:AlternateContent>
-          <mc:Choice Requires="wpg">
+          <mc:Choice Requires="wps">
             <w:drawing>
-              <wp:anchor distT="114300" distB="114300" distL="114300" distR="114300" simplePos="0" relativeHeight="251661312" behindDoc="0" locked="0" layoutInCell="1" hidden="0" allowOverlap="1" wp14:anchorId="17A815BE" wp14:editId="2656DA77">
+              <wp:anchor distT="114300" distB="114300" distL="114300" distR="114300" simplePos="0" relativeHeight="251661312" behindDoc="0" locked="0" layoutInCell="1" hidden="0" allowOverlap="1" wp14:anchorId="64ABAE6B" wp14:editId="294F2DD7">
                 <wp:simplePos x="0" y="0"/>
                 <wp:positionH relativeFrom="column">
                   <wp:posOffset>4167188</wp:posOffset>
@@ -2069,47 +2014,30 @@
               </wp:anchor>
             </w:drawing>
           </mc:Choice>
-          <mc:Fallback xmlns:sl="http://schemas.openxmlformats.org/schemaLibrary/2006/main" xmlns:a="http://schemas.openxmlformats.org/drawingml/2006/main" xmlns:pic="http://schemas.openxmlformats.org/drawingml/2006/picture" xmlns:c="http://schemas.openxmlformats.org/drawingml/2006/chart" xmlns:lc="http://schemas.openxmlformats.org/drawingml/2006/lockedCanvas" xmlns:dgm="http://schemas.openxmlformats.org/drawingml/2006/diagram" xmlns="http://schemas.microsoft.com/office/tasks/2019/documenttasks" xmlns:cr="http://schemas.microsoft.com/office/comments/2020/reactions">
-            <w:drawing>
-              <wp:anchor allowOverlap="1" behindDoc="0" distB="114300" distT="114300" distL="114300" distR="114300" hidden="0" layoutInCell="1" locked="0" relativeHeight="0" simplePos="0">
-                <wp:simplePos x="0" y="0"/>
-                <wp:positionH relativeFrom="column">
-                  <wp:posOffset>4167188</wp:posOffset>
-                </wp:positionH>
-                <wp:positionV relativeFrom="paragraph">
-                  <wp:posOffset>682308</wp:posOffset>
-                </wp:positionV>
-                <wp:extent cx="1914525" cy="647700"/>
-                <wp:effectExtent b="0" l="0" r="0" t="0"/>
-                <wp:wrapNone/>
-                <wp:docPr id="27" name="image4.png"/>
-                <a:graphic>
-                  <a:graphicData uri="http://schemas.openxmlformats.org/drawingml/2006/picture">
-                    <pic:pic>
-                      <pic:nvPicPr>
-                        <pic:cNvPr id="0" name="image4.png"/>
-                        <pic:cNvPicPr preferRelativeResize="0"/>
-                      </pic:nvPicPr>
-                      <pic:blipFill>
-                        <a:blip r:embed="rId11"/>
-                        <a:srcRect/>
-                        <a:stretch>
-                          <a:fillRect/>
-                        </a:stretch>
-                      </pic:blipFill>
-                      <pic:spPr>
-                        <a:xfrm>
-                          <a:off x="0" y="0"/>
-                          <a:ext cx="1914525" cy="647700"/>
-                        </a:xfrm>
-                        <a:prstGeom prst="rect"/>
-                        <a:ln/>
-                      </pic:spPr>
-                    </pic:pic>
-                  </a:graphicData>
-                </a:graphic>
-              </wp:anchor>
-            </w:drawing>
+          <mc:Fallback>
+            <w:pict>
+              <v:rect w14:anchorId="64ABAE6B" id="Rectángulo 27" o:spid="_x0000_s1027" style="position:absolute;left:0;text-align:left;margin-left:328.15pt;margin-top:53.75pt;width:150.75pt;height:51pt;z-index:251661312;visibility:visible;mso-wrap-style:square;mso-wrap-distance-left:9pt;mso-wrap-distance-top:9pt;mso-wrap-distance-right:9pt;mso-wrap-distance-bottom:9pt;mso-position-horizontal:absolute;mso-position-horizontal-relative:text;mso-position-vertical:absolute;mso-position-vertical-relative:text;v-text-anchor:top" o:gfxdata="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" filled="f" stroked="f">
+                <v:textbox inset="2.53958mm,2.53958mm,2.53958mm,2.53958mm">
+                  <w:txbxContent>
+                    <w:p>
+                      <w:pPr>
+                        <w:spacing w:line="240" w:lineRule="auto"/>
+                        <w:textDirection w:val="btLr"/>
+                      </w:pPr>
+                      <w:r>
+                        <w:rPr>
+                          <w:rFonts w:ascii="Times New Roman" w:eastAsia="Times New Roman" w:hAnsi="Times New Roman" w:cs="Times New Roman"/>
+                          <w:b/>
+                          <w:color w:val="000000"/>
+                          <w:sz w:val="28"/>
+                        </w:rPr>
+                        <w:t>ARNES 2 PUNTAS</w:t>
+                      </w:r>
+                    </w:p>
+                  </w:txbxContent>
+                </v:textbox>
+              </v:rect>
+            </w:pict>
           </mc:Fallback>
         </mc:AlternateContent>
       </w:r>
@@ -2204,20 +2132,37 @@
     </w:p>
     <w:p>
       <w:pPr>
+        <w:ind w:right="-182"/>
         <w:jc w:val="both"/>
         <w:rPr>
           <w:rFonts w:ascii="Times New Roman" w:eastAsia="Times New Roman" w:hAnsi="Times New Roman" w:cs="Times New Roman"/>
-          <w:b/>
-          <w:bCs/>
-        </w:rPr>
-      </w:pPr>
-      <w:r>
-        <w:rPr>
-          <w:rFonts w:ascii="Times New Roman" w:eastAsia="Times New Roman" w:hAnsi="Times New Roman" w:cs="Times New Roman"/>
-          <w:b/>
-          <w:bCs/>
-        </w:rPr>
-        <w:lastRenderedPageBreak/>
+        </w:rPr>
+      </w:pPr>
+    </w:p>
+    <w:p>
+      <w:pPr>
+        <w:ind w:right="-182"/>
+        <w:jc w:val="both"/>
+        <w:rPr>
+          <w:rFonts w:ascii="Times New Roman" w:eastAsia="Times New Roman" w:hAnsi="Times New Roman" w:cs="Times New Roman"/>
+        </w:rPr>
+      </w:pPr>
+    </w:p>
+    <w:p>
+      <w:pPr>
+        <w:jc w:val="both"/>
+        <w:rPr>
+          <w:rFonts w:ascii="Times New Roman" w:eastAsia="Times New Roman" w:hAnsi="Times New Roman" w:cs="Times New Roman"/>
+          <w:b/>
+          <w:bCs/>
+        </w:rPr>
+      </w:pPr>
+      <w:r>
+        <w:rPr>
+          <w:rFonts w:ascii="Times New Roman" w:eastAsia="Times New Roman" w:hAnsi="Times New Roman" w:cs="Times New Roman"/>
+          <w:b/>
+          <w:bCs/>
+        </w:rPr>
         <w:t xml:space="preserve">6ª- </w:t>
       </w:r>
       <w:r>
@@ -2226,14 +2171,12 @@
         </w:rPr>
         <w:t xml:space="preserve">Si el domicilio cuenta con terraza, jardín o espacios </w:t>
       </w:r>
-      <w:proofErr w:type="spellStart"/>
-      <w:r>
-        <w:rPr>
-          <w:rFonts w:ascii="Times New Roman" w:eastAsia="Times New Roman" w:hAnsi="Times New Roman" w:cs="Times New Roman"/>
-        </w:rPr>
-        <w:t>semi-abiertos</w:t>
-      </w:r>
-      <w:proofErr w:type="spellEnd"/>
+      <w:r>
+        <w:rPr>
+          <w:rFonts w:ascii="Times New Roman" w:eastAsia="Times New Roman" w:hAnsi="Times New Roman" w:cs="Times New Roman"/>
+        </w:rPr>
+        <w:t>semiabiertos</w:t>
+      </w:r>
       <w:r>
         <w:rPr>
           <w:rFonts w:ascii="Times New Roman" w:eastAsia="Times New Roman" w:hAnsi="Times New Roman" w:cs="Times New Roman"/>
@@ -2684,6 +2627,17 @@
     <w:p>
       <w:pPr>
         <w:widowControl w:val="0"/>
+        <w:spacing w:before="13" w:line="272" w:lineRule="auto"/>
+        <w:ind w:right="-40"/>
+        <w:jc w:val="both"/>
+        <w:rPr>
+          <w:rFonts w:ascii="Times New Roman" w:eastAsia="Times New Roman" w:hAnsi="Times New Roman" w:cs="Times New Roman"/>
+        </w:rPr>
+      </w:pPr>
+    </w:p>
+    <w:p>
+      <w:pPr>
+        <w:widowControl w:val="0"/>
         <w:spacing w:before="13" w:line="240" w:lineRule="auto"/>
         <w:ind w:right="-40"/>
         <w:rPr>
@@ -2734,7 +2688,14 @@
         <w:rPr>
           <w:rFonts w:ascii="Times New Roman" w:eastAsia="Times New Roman" w:hAnsi="Times New Roman" w:cs="Times New Roman"/>
         </w:rPr>
-        <w:t xml:space="preserve">por los gastos veterinarios se concretará previa llamada telefónica y de acuerdo con las condiciones de la adopción y se reflejará en el contrato de adopción. </w:t>
+        <w:t xml:space="preserve">por los gastos veterinarios se concretará previa llamada telefónica y de acuerdo </w:t>
+      </w:r>
+      <w:r>
+        <w:rPr>
+          <w:rFonts w:ascii="Times New Roman" w:eastAsia="Times New Roman" w:hAnsi="Times New Roman" w:cs="Times New Roman"/>
+        </w:rPr>
+        <w:lastRenderedPageBreak/>
+        <w:t xml:space="preserve">con las condiciones de la adopción y se reflejará en el contrato de adopción. </w:t>
       </w:r>
     </w:p>
     <w:p>
@@ -2744,8 +2705,6 @@
         <w:ind w:right="-40"/>
         <w:rPr>
           <w:rFonts w:ascii="Times New Roman" w:eastAsia="Times New Roman" w:hAnsi="Times New Roman" w:cs="Times New Roman"/>
-          <w:b/>
-          <w:bCs/>
         </w:rPr>
       </w:pPr>
     </w:p>
@@ -2779,7 +2738,6 @@
           <w:b/>
           <w:bCs/>
         </w:rPr>
-        <w:lastRenderedPageBreak/>
         <w:t xml:space="preserve">14ª- </w:t>
       </w:r>
       <w:r>
@@ -2933,14 +2891,12 @@
         </w:rPr>
         <w:t xml:space="preserve">El protocolo en las actualizaciones de vacunas, desparasitaciones etc., serán asistidas por personal de la protectora para </w:t>
       </w:r>
-      <w:proofErr w:type="gramStart"/>
-      <w:r>
-        <w:rPr>
-          <w:rFonts w:ascii="Times New Roman" w:eastAsia="Times New Roman" w:hAnsi="Times New Roman" w:cs="Times New Roman"/>
-        </w:rPr>
-        <w:t>llevarles</w:t>
-      </w:r>
-      <w:proofErr w:type="gramEnd"/>
+      <w:r>
+        <w:rPr>
+          <w:rFonts w:ascii="Times New Roman" w:eastAsia="Times New Roman" w:hAnsi="Times New Roman" w:cs="Times New Roman"/>
+        </w:rPr>
+        <w:t>llevarlos</w:t>
+      </w:r>
       <w:r>
         <w:rPr>
           <w:rFonts w:ascii="Times New Roman" w:eastAsia="Times New Roman" w:hAnsi="Times New Roman" w:cs="Times New Roman"/>
@@ -3257,29 +3213,7 @@
           <w:sz w:val="16"/>
           <w:szCs w:val="16"/>
         </w:rPr>
-        <w:t>ARNÉS DOBLE O TRIPLE</w:t>
-      </w:r>
-      <w:proofErr w:type="gramStart"/>
-      <w:r>
-        <w:rPr>
-          <w:rFonts w:ascii="Times New Roman" w:eastAsia="Times New Roman" w:hAnsi="Times New Roman" w:cs="Times New Roman"/>
-          <w:b/>
-          <w:bCs/>
-          <w:sz w:val="16"/>
-          <w:szCs w:val="16"/>
-        </w:rPr>
-        <w:t>…….</w:t>
-      </w:r>
-      <w:proofErr w:type="gramEnd"/>
-      <w:r>
-        <w:rPr>
-          <w:rFonts w:ascii="Times New Roman" w:eastAsia="Times New Roman" w:hAnsi="Times New Roman" w:cs="Times New Roman"/>
-          <w:b/>
-          <w:bCs/>
-          <w:sz w:val="16"/>
-          <w:szCs w:val="16"/>
-        </w:rPr>
-        <w:t xml:space="preserve">……………………….. SI NO </w:t>
+        <w:t xml:space="preserve">ARNÉS DOBLE O TRIPLE…….……………………….. SI NO </w:t>
       </w:r>
     </w:p>
     <w:p>
@@ -3415,29 +3349,7 @@
           <w:sz w:val="16"/>
           <w:szCs w:val="16"/>
         </w:rPr>
-        <w:t>JUGUETES …………………………………………</w:t>
-      </w:r>
-      <w:proofErr w:type="gramStart"/>
-      <w:r>
-        <w:rPr>
-          <w:rFonts w:ascii="Times New Roman" w:eastAsia="Times New Roman" w:hAnsi="Times New Roman" w:cs="Times New Roman"/>
-          <w:b/>
-          <w:bCs/>
-          <w:sz w:val="16"/>
-          <w:szCs w:val="16"/>
-        </w:rPr>
-        <w:t>…….</w:t>
-      </w:r>
-      <w:proofErr w:type="gramEnd"/>
-      <w:r>
-        <w:rPr>
-          <w:rFonts w:ascii="Times New Roman" w:eastAsia="Times New Roman" w:hAnsi="Times New Roman" w:cs="Times New Roman"/>
-          <w:b/>
-          <w:bCs/>
-          <w:sz w:val="16"/>
-          <w:szCs w:val="16"/>
-        </w:rPr>
-        <w:t xml:space="preserve">. SI NO </w:t>
+        <w:t xml:space="preserve">JUGUETES ……………………………………………….. SI NO </w:t>
       </w:r>
     </w:p>
     <w:p>
@@ -3471,29 +3383,7 @@
           <w:sz w:val="16"/>
           <w:szCs w:val="16"/>
         </w:rPr>
-        <w:t>PIENSO / LECHE LACTANTES……………………</w:t>
-      </w:r>
-      <w:proofErr w:type="gramStart"/>
-      <w:r>
-        <w:rPr>
-          <w:rFonts w:ascii="Times New Roman" w:eastAsia="Times New Roman" w:hAnsi="Times New Roman" w:cs="Times New Roman"/>
-          <w:b/>
-          <w:bCs/>
-          <w:sz w:val="16"/>
-          <w:szCs w:val="16"/>
-        </w:rPr>
-        <w:t>…....</w:t>
-      </w:r>
-      <w:proofErr w:type="gramEnd"/>
-      <w:r>
-        <w:rPr>
-          <w:rFonts w:ascii="Times New Roman" w:eastAsia="Times New Roman" w:hAnsi="Times New Roman" w:cs="Times New Roman"/>
-          <w:b/>
-          <w:bCs/>
-          <w:sz w:val="16"/>
-          <w:szCs w:val="16"/>
-        </w:rPr>
-        <w:t xml:space="preserve">SI NO </w:t>
+        <w:t xml:space="preserve">PIENSO / LECHE LACTANTES………………………....SI NO </w:t>
       </w:r>
     </w:p>
     <w:p>
@@ -3629,29 +3519,7 @@
           <w:sz w:val="16"/>
           <w:szCs w:val="16"/>
         </w:rPr>
-        <w:t>BIBERONES …………………………………………</w:t>
-      </w:r>
-      <w:proofErr w:type="gramStart"/>
-      <w:r>
-        <w:rPr>
-          <w:rFonts w:ascii="Times New Roman" w:eastAsia="Times New Roman" w:hAnsi="Times New Roman" w:cs="Times New Roman"/>
-          <w:b/>
-          <w:bCs/>
-          <w:sz w:val="16"/>
-          <w:szCs w:val="16"/>
-        </w:rPr>
-        <w:t>…….</w:t>
-      </w:r>
-      <w:proofErr w:type="gramEnd"/>
-      <w:r>
-        <w:rPr>
-          <w:rFonts w:ascii="Times New Roman" w:eastAsia="Times New Roman" w:hAnsi="Times New Roman" w:cs="Times New Roman"/>
-          <w:b/>
-          <w:bCs/>
-          <w:sz w:val="16"/>
-          <w:szCs w:val="16"/>
-        </w:rPr>
-        <w:t xml:space="preserve">SI NO </w:t>
+        <w:t xml:space="preserve">BIBERONES ……………………………………………….SI NO </w:t>
       </w:r>
     </w:p>
     <w:p>
@@ -3685,29 +3553,7 @@
           <w:sz w:val="16"/>
           <w:szCs w:val="16"/>
         </w:rPr>
-        <w:t>LÁMPARA CALOR …………………………………</w:t>
-      </w:r>
-      <w:proofErr w:type="gramStart"/>
-      <w:r>
-        <w:rPr>
-          <w:rFonts w:ascii="Times New Roman" w:eastAsia="Times New Roman" w:hAnsi="Times New Roman" w:cs="Times New Roman"/>
-          <w:b/>
-          <w:bCs/>
-          <w:sz w:val="16"/>
-          <w:szCs w:val="16"/>
-        </w:rPr>
-        <w:t>…….</w:t>
-      </w:r>
-      <w:proofErr w:type="gramEnd"/>
-      <w:r>
-        <w:rPr>
-          <w:rFonts w:ascii="Times New Roman" w:eastAsia="Times New Roman" w:hAnsi="Times New Roman" w:cs="Times New Roman"/>
-          <w:b/>
-          <w:bCs/>
-          <w:sz w:val="16"/>
-          <w:szCs w:val="16"/>
-        </w:rPr>
-        <w:t xml:space="preserve">SI NO </w:t>
+        <w:t xml:space="preserve">LÁMPARA CALOR ……………………………………….SI NO </w:t>
       </w:r>
     </w:p>
     <w:p>
@@ -3813,25 +3659,18 @@
     <w:p>
       <w:pPr>
         <w:ind w:left="3600" w:firstLine="720"/>
-        <w:rPr>
-          <w:rFonts w:ascii="Times New Roman" w:eastAsia="Times New Roman" w:hAnsi="Times New Roman" w:cs="Times New Roman"/>
-        </w:rPr>
-      </w:pPr>
-      <w:r>
-        <w:rPr>
-          <w:rFonts w:ascii="Times New Roman" w:eastAsia="Times New Roman" w:hAnsi="Times New Roman" w:cs="Times New Roman"/>
-        </w:rPr>
-        <w:t xml:space="preserve">        En Salamanca, a          de                       del 2026            </w:t>
-      </w:r>
-    </w:p>
-    <w:p/>
+      </w:pPr>
+      <w:r>
+        <w:rPr>
+          <w:rFonts w:ascii="Times New Roman" w:eastAsia="Times New Roman" w:hAnsi="Times New Roman" w:cs="Times New Roman"/>
+        </w:rPr>
+        <w:t xml:space="preserve">        En Salamanca, a          de                       del 2026         </w:t>
+      </w:r>
+    </w:p>
     <w:sectPr>
-      <w:headerReference w:type="even" r:id="rId13"/>
-      <w:headerReference w:type="default" r:id="rId14"/>
-      <w:footerReference w:type="even" r:id="rId15"/>
-      <w:footerReference w:type="default" r:id="rId16"/>
-      <w:headerReference w:type="first" r:id="rId17"/>
-      <w:footerReference w:type="first" r:id="rId18"/>
+      <w:headerReference w:type="even" r:id="rId12"/>
+      <w:headerReference w:type="default" r:id="rId13"/>
+      <w:headerReference w:type="first" r:id="rId14"/>
       <w:pgSz w:w="11909" w:h="16834"/>
       <w:pgMar w:top="1440" w:right="1440" w:bottom="1440" w:left="1440" w:header="720" w:footer="425" w:gutter="0"/>
       <w:pgNumType w:start="1"/>
@@ -3866,24 +3705,6 @@
 </w:endnotes>
 </file>
 
-<file path=word/footer1.xml><?xml version="1.0" encoding="utf-8"?>
-<w:ftr xmlns:wpc="http://schemas.microsoft.com/office/word/2010/wordprocessingCanvas" xmlns:cx="http://schemas.microsoft.com/office/drawing/2014/chartex" xmlns:cx1="http://schemas.microsoft.com/office/drawing/2015/9/8/chartex" xmlns:cx2="http://schemas.microsoft.com/office/drawing/2015/10/21/chartex" xmlns:cx3="http://schemas.microsoft.com/office/drawing/2016/5/9/chartex" xmlns:cx4="http://schemas.microsoft.com/office/drawing/2016/5/10/chartex" xmlns:cx5="http://schemas.microsoft.com/office/drawing/2016/5/11/chartex" xmlns:cx6="http://schemas.microsoft.com/office/drawing/2016/5/12/chartex" xmlns:cx7="http://schemas.microsoft.com/office/drawing/2016/5/13/chartex" xmlns:cx8="http://schemas.microsoft.com/office/drawing/2016/5/14/chartex" xmlns:mc="http://schemas.openxmlformats.org/markup-compatibility/2006" xmlns:aink="http://schemas.microsoft.com/office/drawing/2016/ink" xmlns:am3d="http://schemas.microsoft.com/office/drawing/2017/model3d" xmlns:o="urn:schemas-microsoft-com:office:office" xmlns:oel="http://schemas.microsoft.com/office/2019/extlst" xmlns:r="http://schemas.openxmlformats.org/officeDocument/2006/relationships" xmlns:m="http://schemas.openxmlformats.org/officeDocument/2006/math" xmlns:v="urn:schemas-microsoft-com:vml" xmlns:wp14="http://schemas.microsoft.com/office/word/2010/wordprocessingDrawing" xmlns:wp="http://schemas.openxmlformats.org/drawingml/2006/wordprocessingDrawing" xmlns:w10="urn:schemas-microsoft-com:office:word" xmlns:w="http://schemas.openxmlformats.org/wordprocessingml/2006/main" xmlns:w14="http://schemas.microsoft.com/office/word/2010/wordml" xmlns:w15="http://schemas.microsoft.com/office/word/2012/wordml" xmlns:w16cex="http://schemas.microsoft.com/office/word/2018/wordml/cex" xmlns:w16cid="http://schemas.microsoft.com/office/word/2016/wordml/cid" xmlns:w16="http://schemas.microsoft.com/office/word/2018/wordml" xmlns:w16sdtdh="http://schemas.microsoft.com/office/word/2020/wordml/sdtdatahash" xmlns:w16se="http://schemas.microsoft.com/office/word/2015/wordml/symex" xmlns:wpg="http://schemas.microsoft.com/office/word/2010/wordprocessingGroup" xmlns:wpi="http://schemas.microsoft.com/office/word/2010/wordprocessingInk" xmlns:wne="http://schemas.microsoft.com/office/word/2006/wordml" xmlns:wps="http://schemas.microsoft.com/office/word/2010/wordprocessingShape" mc:Ignorable="w14 w15 w16se w16cid w16 w16cex w16sdtdh wp14">
-  <w:p/>
-</w:ftr>
-</file>
-
-<file path=word/footer2.xml><?xml version="1.0" encoding="utf-8"?>
-<w:ftr xmlns:wpc="http://schemas.microsoft.com/office/word/2010/wordprocessingCanvas" xmlns:cx="http://schemas.microsoft.com/office/drawing/2014/chartex" xmlns:cx1="http://schemas.microsoft.com/office/drawing/2015/9/8/chartex" xmlns:cx2="http://schemas.microsoft.com/office/drawing/2015/10/21/chartex" xmlns:cx3="http://schemas.microsoft.com/office/drawing/2016/5/9/chartex" xmlns:cx4="http://schemas.microsoft.com/office/drawing/2016/5/10/chartex" xmlns:cx5="http://schemas.microsoft.com/office/drawing/2016/5/11/chartex" xmlns:cx6="http://schemas.microsoft.com/office/drawing/2016/5/12/chartex" xmlns:cx7="http://schemas.microsoft.com/office/drawing/2016/5/13/chartex" xmlns:cx8="http://schemas.microsoft.com/office/drawing/2016/5/14/chartex" xmlns:mc="http://schemas.openxmlformats.org/markup-compatibility/2006" xmlns:aink="http://schemas.microsoft.com/office/drawing/2016/ink" xmlns:am3d="http://schemas.microsoft.com/office/drawing/2017/model3d" xmlns:o="urn:schemas-microsoft-com:office:office" xmlns:oel="http://schemas.microsoft.com/office/2019/extlst" xmlns:r="http://schemas.openxmlformats.org/officeDocument/2006/relationships" xmlns:m="http://schemas.openxmlformats.org/officeDocument/2006/math" xmlns:v="urn:schemas-microsoft-com:vml" xmlns:wp14="http://schemas.microsoft.com/office/word/2010/wordprocessingDrawing" xmlns:wp="http://schemas.openxmlformats.org/drawingml/2006/wordprocessingDrawing" xmlns:w10="urn:schemas-microsoft-com:office:word" xmlns:w="http://schemas.openxmlformats.org/wordprocessingml/2006/main" xmlns:w14="http://schemas.microsoft.com/office/word/2010/wordml" xmlns:w15="http://schemas.microsoft.com/office/word/2012/wordml" xmlns:w16cex="http://schemas.microsoft.com/office/word/2018/wordml/cex" xmlns:w16cid="http://schemas.microsoft.com/office/word/2016/wordml/cid" xmlns:w16="http://schemas.microsoft.com/office/word/2018/wordml" xmlns:w16sdtdh="http://schemas.microsoft.com/office/word/2020/wordml/sdtdatahash" xmlns:w16se="http://schemas.microsoft.com/office/word/2015/wordml/symex" xmlns:wpg="http://schemas.microsoft.com/office/word/2010/wordprocessingGroup" xmlns:wpi="http://schemas.microsoft.com/office/word/2010/wordprocessingInk" xmlns:wne="http://schemas.microsoft.com/office/word/2006/wordml" xmlns:wps="http://schemas.microsoft.com/office/word/2010/wordprocessingShape" mc:Ignorable="w14 w15 w16se w16cid w16 w16cex w16sdtdh wp14">
-  <w:p/>
-</w:ftr>
-</file>
-
-<file path=word/footer3.xml><?xml version="1.0" encoding="utf-8"?>
-<w:ftr xmlns:wpc="http://schemas.microsoft.com/office/word/2010/wordprocessingCanvas" xmlns:cx="http://schemas.microsoft.com/office/drawing/2014/chartex" xmlns:cx1="http://schemas.microsoft.com/office/drawing/2015/9/8/chartex" xmlns:cx2="http://schemas.microsoft.com/office/drawing/2015/10/21/chartex" xmlns:cx3="http://schemas.microsoft.com/office/drawing/2016/5/9/chartex" xmlns:cx4="http://schemas.microsoft.com/office/drawing/2016/5/10/chartex" xmlns:cx5="http://schemas.microsoft.com/office/drawing/2016/5/11/chartex" xmlns:cx6="http://schemas.microsoft.com/office/drawing/2016/5/12/chartex" xmlns:cx7="http://schemas.microsoft.com/office/drawing/2016/5/13/chartex" xmlns:cx8="http://schemas.microsoft.com/office/drawing/2016/5/14/chartex" xmlns:mc="http://schemas.openxmlformats.org/markup-compatibility/2006" xmlns:aink="http://schemas.microsoft.com/office/drawing/2016/ink" xmlns:am3d="http://schemas.microsoft.com/office/drawing/2017/model3d" xmlns:o="urn:schemas-microsoft-com:office:office" xmlns:oel="http://schemas.microsoft.com/office/2019/extlst" xmlns:r="http://schemas.openxmlformats.org/officeDocument/2006/relationships" xmlns:m="http://schemas.openxmlformats.org/officeDocument/2006/math" xmlns:v="urn:schemas-microsoft-com:vml" xmlns:wp14="http://schemas.microsoft.com/office/word/2010/wordprocessingDrawing" xmlns:wp="http://schemas.openxmlformats.org/drawingml/2006/wordprocessingDrawing" xmlns:w10="urn:schemas-microsoft-com:office:word" xmlns:w="http://schemas.openxmlformats.org/wordprocessingml/2006/main" xmlns:w14="http://schemas.microsoft.com/office/word/2010/wordml" xmlns:w15="http://schemas.microsoft.com/office/word/2012/wordml" xmlns:w16cex="http://schemas.microsoft.com/office/word/2018/wordml/cex" xmlns:w16cid="http://schemas.microsoft.com/office/word/2016/wordml/cid" xmlns:w16="http://schemas.microsoft.com/office/word/2018/wordml" xmlns:w16sdtdh="http://schemas.microsoft.com/office/word/2020/wordml/sdtdatahash" xmlns:w16se="http://schemas.microsoft.com/office/word/2015/wordml/symex" xmlns:wpg="http://schemas.microsoft.com/office/word/2010/wordprocessingGroup" xmlns:wpi="http://schemas.microsoft.com/office/word/2010/wordprocessingInk" xmlns:wne="http://schemas.microsoft.com/office/word/2006/wordml" xmlns:wps="http://schemas.microsoft.com/office/word/2010/wordprocessingShape" mc:Ignorable="w14 w15 w16se w16cid w16 w16cex w16sdtdh wp14">
-  <w:p/>
-</w:ftr>
-</file>
-
 <file path=word/footnotes.xml><?xml version="1.0" encoding="utf-8"?>
 <w:footnotes xmlns:wpc="http://schemas.microsoft.com/office/word/2010/wordprocessingCanvas" xmlns:cx="http://schemas.microsoft.com/office/drawing/2014/chartex" xmlns:cx1="http://schemas.microsoft.com/office/drawing/2015/9/8/chartex" xmlns:cx2="http://schemas.microsoft.com/office/drawing/2015/10/21/chartex" xmlns:cx3="http://schemas.microsoft.com/office/drawing/2016/5/9/chartex" xmlns:cx4="http://schemas.microsoft.com/office/drawing/2016/5/10/chartex" xmlns:cx5="http://schemas.microsoft.com/office/drawing/2016/5/11/chartex" xmlns:cx6="http://schemas.microsoft.com/office/drawing/2016/5/12/chartex" xmlns:cx7="http://schemas.microsoft.com/office/drawing/2016/5/13/chartex" xmlns:cx8="http://schemas.microsoft.com/office/drawing/2016/5/14/chartex" xmlns:mc="http://schemas.openxmlformats.org/markup-compatibility/2006" xmlns:aink="http://schemas.microsoft.com/office/drawing/2016/ink" xmlns:am3d="http://schemas.microsoft.com/office/drawing/2017/model3d" xmlns:o="urn:schemas-microsoft-com:office:office" xmlns:oel="http://schemas.microsoft.com/office/2019/extlst" xmlns:r="http://schemas.openxmlformats.org/officeDocument/2006/relationships" xmlns:m="http://schemas.openxmlformats.org/officeDocument/2006/math" xmlns:v="urn:schemas-microsoft-com:vml" xmlns:wp14="http://schemas.microsoft.com/office/word/2010/wordprocessingDrawing" xmlns:wp="http://schemas.openxmlformats.org/drawingml/2006/wordprocessingDrawing" xmlns:w10="urn:schemas-microsoft-com:office:word" xmlns:w="http://schemas.openxmlformats.org/wordprocessingml/2006/main" xmlns:w14="http://schemas.microsoft.com/office/word/2010/wordml" xmlns:w15="http://schemas.microsoft.com/office/word/2012/wordml" xmlns:w16cex="http://schemas.microsoft.com/office/word/2018/wordml/cex" xmlns:w16cid="http://schemas.microsoft.com/office/word/2016/wordml/cid" xmlns:w16="http://schemas.microsoft.com/office/word/2018/wordml" xmlns:w16sdtdh="http://schemas.microsoft.com/office/word/2020/wordml/sdtdatahash" xmlns:w16se="http://schemas.microsoft.com/office/word/2015/wordml/symex" xmlns:wpg="http://schemas.microsoft.com/office/word/2010/wordprocessingGroup" xmlns:wpi="http://schemas.microsoft.com/office/word/2010/wordprocessingInk" xmlns:wne="http://schemas.microsoft.com/office/word/2006/wordml" xmlns:wps="http://schemas.microsoft.com/office/word/2010/wordprocessingShape" mc:Ignorable="w14 w15 w16se w16cid w16 w16cex w16sdtdh wp14">
   <w:footnote w:type="separator" w:id="-1">
@@ -3913,7 +3734,7 @@
 <w:hdr xmlns:wpc="http://schemas.microsoft.com/office/word/2010/wordprocessingCanvas" xmlns:cx="http://schemas.microsoft.com/office/drawing/2014/chartex" xmlns:cx1="http://schemas.microsoft.com/office/drawing/2015/9/8/chartex" xmlns:cx2="http://schemas.microsoft.com/office/drawing/2015/10/21/chartex" xmlns:cx3="http://schemas.microsoft.com/office/drawing/2016/5/9/chartex" xmlns:cx4="http://schemas.microsoft.com/office/drawing/2016/5/10/chartex" xmlns:cx5="http://schemas.microsoft.com/office/drawing/2016/5/11/chartex" xmlns:cx6="http://schemas.microsoft.com/office/drawing/2016/5/12/chartex" xmlns:cx7="http://schemas.microsoft.com/office/drawing/2016/5/13/chartex" xmlns:cx8="http://schemas.microsoft.com/office/drawing/2016/5/14/chartex" xmlns:mc="http://schemas.openxmlformats.org/markup-compatibility/2006" xmlns:aink="http://schemas.microsoft.com/office/drawing/2016/ink" xmlns:am3d="http://schemas.microsoft.com/office/drawing/2017/model3d" xmlns:o="urn:schemas-microsoft-com:office:office" xmlns:oel="http://schemas.microsoft.com/office/2019/extlst" xmlns:r="http://schemas.openxmlformats.org/officeDocument/2006/relationships" xmlns:m="http://schemas.openxmlformats.org/officeDocument/2006/math" xmlns:v="urn:schemas-microsoft-com:vml" xmlns:wp14="http://schemas.microsoft.com/office/word/2010/wordprocessingDrawing" xmlns:wp="http://schemas.openxmlformats.org/drawingml/2006/wordprocessingDrawing" xmlns:w10="urn:schemas-microsoft-com:office:word" xmlns:w="http://schemas.openxmlformats.org/wordprocessingml/2006/main" xmlns:w14="http://schemas.microsoft.com/office/word/2010/wordml" xmlns:w15="http://schemas.microsoft.com/office/word/2012/wordml" xmlns:w16cex="http://schemas.microsoft.com/office/word/2018/wordml/cex" xmlns:w16cid="http://schemas.microsoft.com/office/word/2016/wordml/cid" xmlns:w16="http://schemas.microsoft.com/office/word/2018/wordml" xmlns:w16sdtdh="http://schemas.microsoft.com/office/word/2020/wordml/sdtdatahash" xmlns:w16se="http://schemas.microsoft.com/office/word/2015/wordml/symex" xmlns:wpg="http://schemas.microsoft.com/office/word/2010/wordprocessingGroup" xmlns:wpi="http://schemas.microsoft.com/office/word/2010/wordprocessingInk" xmlns:wne="http://schemas.microsoft.com/office/word/2006/wordml" xmlns:wps="http://schemas.microsoft.com/office/word/2010/wordprocessingShape" mc:Ignorable="w14 w15 w16se w16cid w16 w16cex w16sdtdh wp14">
   <w:p>
     <w:r>
-      <w:pict w14:anchorId="688EE844">
+      <w:pict w14:anchorId="36EE1959">
         <v:shapetype id="_x0000_t75" coordsize="21600,21600" o:spt="75" o:preferrelative="t" path="m@4@5l@4@11@9@11@9@5xe" filled="f" stroked="f">
           <v:stroke joinstyle="miter"/>
           <v:formulas>
@@ -3956,7 +3777,6 @@
         <w:szCs w:val="16"/>
       </w:rPr>
     </w:pPr>
-    <w:proofErr w:type="spellStart"/>
     <w:r>
       <w:rPr>
         <w:rFonts w:ascii="Times New Roman" w:eastAsia="Times New Roman" w:hAnsi="Times New Roman" w:cs="Times New Roman"/>
@@ -3965,18 +3785,7 @@
         <w:sz w:val="28"/>
         <w:szCs w:val="28"/>
       </w:rPr>
-      <w:t>Asoc</w:t>
-    </w:r>
-    <w:proofErr w:type="spellEnd"/>
-    <w:r>
-      <w:rPr>
-        <w:rFonts w:ascii="Times New Roman" w:eastAsia="Times New Roman" w:hAnsi="Times New Roman" w:cs="Times New Roman"/>
-        <w:b/>
-        <w:bCs/>
-        <w:sz w:val="28"/>
-        <w:szCs w:val="28"/>
-      </w:rPr>
-      <w:t>. Protectora de Animales y Plantas Siempre Fiel</w:t>
+      <w:t>Asoc. Protectora de Animales y Plantas Siempre Fiel</w:t>
     </w:r>
     <w:r>
       <w:rPr>
@@ -3992,7 +3801,7 @@
         <w:noProof/>
       </w:rPr>
       <w:drawing>
-        <wp:anchor distT="0" distB="0" distL="0" distR="0" simplePos="0" relativeHeight="251656704" behindDoc="1" locked="0" layoutInCell="1" hidden="0" allowOverlap="1" wp14:anchorId="4D7163DA" wp14:editId="1210724C">
+        <wp:anchor distT="0" distB="0" distL="0" distR="0" simplePos="0" relativeHeight="251656704" behindDoc="1" locked="0" layoutInCell="1" hidden="0" allowOverlap="1" wp14:anchorId="674F494A" wp14:editId="67BB938B">
           <wp:simplePos x="0" y="0"/>
           <wp:positionH relativeFrom="column">
             <wp:posOffset>5124450</wp:posOffset>
@@ -4201,7 +4010,7 @@
 <w:hdr xmlns:wpc="http://schemas.microsoft.com/office/word/2010/wordprocessingCanvas" xmlns:cx="http://schemas.microsoft.com/office/drawing/2014/chartex" xmlns:cx1="http://schemas.microsoft.com/office/drawing/2015/9/8/chartex" xmlns:cx2="http://schemas.microsoft.com/office/drawing/2015/10/21/chartex" xmlns:cx3="http://schemas.microsoft.com/office/drawing/2016/5/9/chartex" xmlns:cx4="http://schemas.microsoft.com/office/drawing/2016/5/10/chartex" xmlns:cx5="http://schemas.microsoft.com/office/drawing/2016/5/11/chartex" xmlns:cx6="http://schemas.microsoft.com/office/drawing/2016/5/12/chartex" xmlns:cx7="http://schemas.microsoft.com/office/drawing/2016/5/13/chartex" xmlns:cx8="http://schemas.microsoft.com/office/drawing/2016/5/14/chartex" xmlns:mc="http://schemas.openxmlformats.org/markup-compatibility/2006" xmlns:aink="http://schemas.microsoft.com/office/drawing/2016/ink" xmlns:am3d="http://schemas.microsoft.com/office/drawing/2017/model3d" xmlns:o="urn:schemas-microsoft-com:office:office" xmlns:oel="http://schemas.microsoft.com/office/2019/extlst" xmlns:r="http://schemas.openxmlformats.org/officeDocument/2006/relationships" xmlns:m="http://schemas.openxmlformats.org/officeDocument/2006/math" xmlns:v="urn:schemas-microsoft-com:vml" xmlns:wp14="http://schemas.microsoft.com/office/word/2010/wordprocessingDrawing" xmlns:wp="http://schemas.openxmlformats.org/drawingml/2006/wordprocessingDrawing" xmlns:w10="urn:schemas-microsoft-com:office:word" xmlns:w="http://schemas.openxmlformats.org/wordprocessingml/2006/main" xmlns:w14="http://schemas.microsoft.com/office/word/2010/wordml" xmlns:w15="http://schemas.microsoft.com/office/word/2012/wordml" xmlns:w16cex="http://schemas.microsoft.com/office/word/2018/wordml/cex" xmlns:w16cid="http://schemas.microsoft.com/office/word/2016/wordml/cid" xmlns:w16="http://schemas.microsoft.com/office/word/2018/wordml" xmlns:w16sdtdh="http://schemas.microsoft.com/office/word/2020/wordml/sdtdatahash" xmlns:w16se="http://schemas.microsoft.com/office/word/2015/wordml/symex" xmlns:wpg="http://schemas.microsoft.com/office/word/2010/wordprocessingGroup" xmlns:wpi="http://schemas.microsoft.com/office/word/2010/wordprocessingInk" xmlns:wne="http://schemas.microsoft.com/office/word/2006/wordml" xmlns:wps="http://schemas.microsoft.com/office/word/2010/wordprocessingShape" mc:Ignorable="w14 w15 w16se w16cid w16 w16cex w16sdtdh wp14">
   <w:p>
     <w:r>
-      <w:pict w14:anchorId="1BFD87C2">
+      <w:pict w14:anchorId="22181869">
         <v:shapetype id="_x0000_t75" coordsize="21600,21600" o:spt="75" o:preferrelative="t" path="m@4@5l@4@11@9@11@9@5xe" filled="f" stroked="f">
           <v:stroke joinstyle="miter"/>
           <v:formulas>
@@ -4234,9 +4043,9 @@
 <file path=word/numbering.xml><?xml version="1.0" encoding="utf-8"?>
 <w:numbering xmlns:wpc="http://schemas.microsoft.com/office/word/2010/wordprocessingCanvas" xmlns:cx="http://schemas.microsoft.com/office/drawing/2014/chartex" xmlns:cx1="http://schemas.microsoft.com/office/drawing/2015/9/8/chartex" xmlns:cx2="http://schemas.microsoft.com/office/drawing/2015/10/21/chartex" xmlns:cx3="http://schemas.microsoft.com/office/drawing/2016/5/9/chartex" xmlns:cx4="http://schemas.microsoft.com/office/drawing/2016/5/10/chartex" xmlns:cx5="http://schemas.microsoft.com/office/drawing/2016/5/11/chartex" xmlns:cx6="http://schemas.microsoft.com/office/drawing/2016/5/12/chartex" xmlns:cx7="http://schemas.microsoft.com/office/drawing/2016/5/13/chartex" xmlns:cx8="http://schemas.microsoft.com/office/drawing/2016/5/14/chartex" xmlns:mc="http://schemas.openxmlformats.org/markup-compatibility/2006" xmlns:aink="http://schemas.microsoft.com/office/drawing/2016/ink" xmlns:am3d="http://schemas.microsoft.com/office/drawing/2017/model3d" xmlns:o="urn:schemas-microsoft-com:office:office" xmlns:oel="http://schemas.microsoft.com/office/2019/extlst" xmlns:r="http://schemas.openxmlformats.org/officeDocument/2006/relationships" xmlns:m="http://schemas.openxmlformats.org/officeDocument/2006/math" xmlns:v="urn:schemas-microsoft-com:vml" xmlns:wp14="http://schemas.microsoft.com/office/word/2010/wordprocessingDrawing" xmlns:wp="http://schemas.openxmlformats.org/drawingml/2006/wordprocessingDrawing" xmlns:w10="urn:schemas-microsoft-com:office:word" xmlns:w="http://schemas.openxmlformats.org/wordprocessingml/2006/main" xmlns:w14="http://schemas.microsoft.com/office/word/2010/wordml" xmlns:w15="http://schemas.microsoft.com/office/word/2012/wordml" xmlns:w16cex="http://schemas.microsoft.com/office/word/2018/wordml/cex" xmlns:w16cid="http://schemas.microsoft.com/office/word/2016/wordml/cid" xmlns:w16="http://schemas.microsoft.com/office/word/2018/wordml" xmlns:w16sdtdh="http://schemas.microsoft.com/office/word/2020/wordml/sdtdatahash" xmlns:w16se="http://schemas.microsoft.com/office/word/2015/wordml/symex" xmlns:wpg="http://schemas.microsoft.com/office/word/2010/wordprocessingGroup" xmlns:wpi="http://schemas.microsoft.com/office/word/2010/wordprocessingInk" xmlns:wne="http://schemas.microsoft.com/office/word/2006/wordml" xmlns:wps="http://schemas.microsoft.com/office/word/2010/wordprocessingShape" mc:Ignorable="w14 w15 w16se w16cid w16 w16cex w16sdtdh wp14">
   <w:abstractNum w:abstractNumId="0" w15:restartNumberingAfterBreak="0">
-    <w:nsid w:val="109A1D5A"/>
+    <w:nsid w:val="047775AA"/>
     <w:multiLevelType w:val="multilevel"/>
-    <w:tmpl w:val="63A087EA"/>
+    <w:tmpl w:val="7CF40AAA"/>
     <w:lvl w:ilvl="0">
       <w:start w:val="1"/>
       <w:numFmt w:val="bullet"/>
@@ -4347,9 +4156,9 @@
     </w:lvl>
   </w:abstractNum>
   <w:abstractNum w:abstractNumId="1" w15:restartNumberingAfterBreak="0">
-    <w:nsid w:val="764D3EFB"/>
+    <w:nsid w:val="4EFF5BEF"/>
     <w:multiLevelType w:val="multilevel"/>
-    <w:tmpl w:val="AA787258"/>
+    <w:tmpl w:val="335829AA"/>
     <w:lvl w:ilvl="0">
       <w:start w:val="1"/>
       <w:numFmt w:val="bullet"/>
@@ -4462,10 +4271,10 @@
       </w:rPr>
     </w:lvl>
   </w:abstractNum>
-  <w:num w:numId="1" w16cid:durableId="1084258363">
+  <w:num w:numId="1" w16cid:durableId="944657787">
     <w:abstractNumId w:val="0"/>
   </w:num>
-  <w:num w:numId="2" w16cid:durableId="1321613005">
+  <w:num w:numId="2" w16cid:durableId="2140605027">
     <w:abstractNumId w:val="1"/>
   </w:num>
 </w:numbering>
@@ -5509,7 +5318,7 @@
 </file>
 
 <file path=customXml/itemProps1.xml><?xml version="1.0" encoding="utf-8"?>
-<ds:datastoreItem xmlns:ds="http://schemas.openxmlformats.org/officeDocument/2006/customXml" ds:itemID="{37EFB915-CDCE-488F-BCC9-82AB71691BA4}">
+<ds:datastoreItem xmlns:ds="http://schemas.openxmlformats.org/officeDocument/2006/customXml" ds:itemID="{44EBE2B0-03A8-4842-A6FE-69F5042D89A2}">
   <ds:schemaRefs>
     <ds:schemaRef ds:uri="http://schemas.openxmlformats.org/officeDocument/2006/bibliography"/>
   </ds:schemaRefs>

</xml_diff>